<commit_message>
Remove author and discipline mentions; remove math formulas from section 3
</commit_message>
<xml_diff>
--- a/moibd_estate/GROUP_PROJECT_REPORT.docx
+++ b/moibd_estate/GROUP_PROJECT_REPORT.docx
@@ -22,19 +22,7 @@
       <w:pPr>
         <w:jc w:val="right"/>
       </w:pPr>
-      <w:r>
-        <w:rPr>
-          <w:i/>
-          <w:sz w:val="20"/>
-        </w:rPr>
-        <w:t>Автор: Nezire</w:t>
-        <w:br/>
-        <w:t>Группа: МОИБД</w:t>
-        <w:br/>
-        <w:t>Дисциплина: Методы оптимизации и интеллектуального анализа данных</w:t>
-        <w:br/>
-        <w:t>Версия проекта: 2.0 Pro</w:t>
-      </w:r>
+      <w:r/>
     </w:p>
     <w:p>
       <w:pPr>
@@ -659,8 +647,6 @@
         <w:br/>
         <w:t>• Описание алгоритма Random Forest, гиперпараметров, сильных сторон и практических ограничений модели.</w:t>
         <w:br/>
-        <w:t>• Сведения об авторстве (Nezire, проект МОИБД), версии релиза (v2.0 Pro) и стек технологий.</w:t>
-        <w:br/>
         <w:br/>
         <w:t>4.4 Технические стандарты:</w:t>
         <w:br/>

</xml_diff>